<commit_message>
Update CPP102 Week 1 module green theme
</commit_message>
<xml_diff>
--- a/CPP102-Programming-Logic-and-Design/Week01/CPP102_Week1_Lecture_Lab_Module.docx
+++ b/CPP102-Programming-Logic-and-Design/Week01/CPP102_Week1_Lecture_Lab_Module.docx
@@ -11,7 +11,7 @@
         <w:rPr>
           <w:b/>
           <w:bCs/>
-          <w:color w:val="1F3864"/>
+          <w:color w:val="1A5E20"/>
           <w:sz w:val="32"/>
           <w:szCs w:val="32"/>
         </w:rPr>
@@ -65,7 +65,7 @@
     <w:p>
       <w:pPr>
         <w:pBdr>
-          <w:bottom w:val="single" w:color="2E75B6" w:sz="6" w:space="1"/>
+          <w:bottom w:val="single" w:color="2E7D32" w:sz="6" w:space="1"/>
         </w:pBdr>
         <w:spacing w:after="200" w:before="80"/>
       </w:pPr>
@@ -710,7 +710,7 @@
               <w:bottom w:val="single" w:color="BFBFBF" w:sz="4"/>
               <w:right w:val="single" w:color="BFBFBF" w:sz="4"/>
             </w:tcBorders>
-            <w:shd w:fill="1F3864" w:val="clear"/>
+            <w:shd w:fill="1A5E20" w:val="clear"/>
             <w:tcMar>
               <w:top w:type="dxa" w:w="80"/>
               <w:left w:type="dxa" w:w="120"/>
@@ -746,7 +746,7 @@
               <w:bottom w:val="single" w:color="BFBFBF" w:sz="4"/>
               <w:right w:val="single" w:color="BFBFBF" w:sz="4"/>
             </w:tcBorders>
-            <w:shd w:fill="1F3864" w:val="clear"/>
+            <w:shd w:fill="1A5E20" w:val="clear"/>
             <w:tcMar>
               <w:top w:type="dxa" w:w="80"/>
               <w:left w:type="dxa" w:w="120"/>
@@ -1254,7 +1254,7 @@
               <w:bottom w:val="single" w:color="BFBFBF" w:sz="4"/>
               <w:right w:val="single" w:color="BFBFBF" w:sz="4"/>
             </w:tcBorders>
-            <w:shd w:fill="1F3864" w:val="clear"/>
+            <w:shd w:fill="1A5E20" w:val="clear"/>
             <w:tcMar>
               <w:top w:type="dxa" w:w="80"/>
               <w:left w:type="dxa" w:w="120"/>
@@ -1290,7 +1290,7 @@
               <w:bottom w:val="single" w:color="BFBFBF" w:sz="4"/>
               <w:right w:val="single" w:color="BFBFBF" w:sz="4"/>
             </w:tcBorders>
-            <w:shd w:fill="1F3864" w:val="clear"/>
+            <w:shd w:fill="1A5E20" w:val="clear"/>
             <w:tcMar>
               <w:top w:type="dxa" w:w="80"/>
               <w:left w:type="dxa" w:w="120"/>
@@ -1894,7 +1894,7 @@
               <w:bottom w:val="single" w:color="BFBFBF" w:sz="4"/>
               <w:right w:val="single" w:color="BFBFBF" w:sz="4"/>
             </w:tcBorders>
-            <w:shd w:fill="1F3864" w:val="clear"/>
+            <w:shd w:fill="1A5E20" w:val="clear"/>
             <w:tcMar>
               <w:top w:type="dxa" w:w="80"/>
               <w:left w:type="dxa" w:w="120"/>
@@ -1930,7 +1930,7 @@
               <w:bottom w:val="single" w:color="BFBFBF" w:sz="4"/>
               <w:right w:val="single" w:color="BFBFBF" w:sz="4"/>
             </w:tcBorders>
-            <w:shd w:fill="1F3864" w:val="clear"/>
+            <w:shd w:fill="1A5E20" w:val="clear"/>
             <w:tcMar>
               <w:top w:type="dxa" w:w="80"/>
               <w:left w:type="dxa" w:w="120"/>
@@ -2686,7 +2686,7 @@
               <w:bottom w:val="single" w:color="BFBFBF" w:sz="4"/>
               <w:right w:val="single" w:color="BFBFBF" w:sz="4"/>
             </w:tcBorders>
-            <w:shd w:fill="1F3864" w:val="clear"/>
+            <w:shd w:fill="1A5E20" w:val="clear"/>
             <w:tcMar>
               <w:top w:type="dxa" w:w="80"/>
               <w:left w:type="dxa" w:w="120"/>
@@ -2722,7 +2722,7 @@
               <w:bottom w:val="single" w:color="BFBFBF" w:sz="4"/>
               <w:right w:val="single" w:color="BFBFBF" w:sz="4"/>
             </w:tcBorders>
-            <w:shd w:fill="1F3864" w:val="clear"/>
+            <w:shd w:fill="1A5E20" w:val="clear"/>
             <w:tcMar>
               <w:top w:type="dxa" w:w="80"/>
               <w:left w:type="dxa" w:w="120"/>
@@ -2758,7 +2758,7 @@
               <w:bottom w:val="single" w:color="BFBFBF" w:sz="4"/>
               <w:right w:val="single" w:color="BFBFBF" w:sz="4"/>
             </w:tcBorders>
-            <w:shd w:fill="1F3864" w:val="clear"/>
+            <w:shd w:fill="1A5E20" w:val="clear"/>
             <w:tcMar>
               <w:top w:type="dxa" w:w="80"/>
               <w:left w:type="dxa" w:w="120"/>
@@ -3356,12 +3356,12 @@
           <w:tcPr>
             <w:tcW w:type="dxa" w:w="9360"/>
             <w:tcBorders>
-              <w:top w:val="single" w:color="2E75B6" w:sz="4"/>
-              <w:left w:val="single" w:color="2E75B6" w:sz="4"/>
-              <w:bottom w:val="single" w:color="2E75B6" w:sz="4"/>
-              <w:right w:val="single" w:color="2E75B6" w:sz="4"/>
-            </w:tcBorders>
-            <w:shd w:fill="E8F4FD" w:val="clear"/>
+              <w:top w:val="single" w:color="2E7D32" w:sz="4"/>
+              <w:left w:val="single" w:color="2E7D32" w:sz="4"/>
+              <w:bottom w:val="single" w:color="2E7D32" w:sz="4"/>
+              <w:right w:val="single" w:color="2E7D32" w:sz="4"/>
+            </w:tcBorders>
+            <w:shd w:fill="E8F5E9" w:val="clear"/>
             <w:tcMar>
               <w:top w:type="dxa" w:w="120"/>
               <w:left w:type="dxa" w:w="160"/>
@@ -3377,7 +3377,7 @@
               <w:rPr>
                 <w:b/>
                 <w:bCs/>
-                <w:color w:val="1F3864"/>
+                <w:color w:val="1A5E20"/>
                 <w:sz w:val="22"/>
                 <w:szCs w:val="22"/>
               </w:rPr>
@@ -3567,7 +3567,7 @@
               <w:bottom w:val="single" w:color="BFBFBF" w:sz="4"/>
               <w:right w:val="single" w:color="BFBFBF" w:sz="4"/>
             </w:tcBorders>
-            <w:shd w:fill="1F3864" w:val="clear"/>
+            <w:shd w:fill="1A5E20" w:val="clear"/>
             <w:tcMar>
               <w:top w:type="dxa" w:w="80"/>
               <w:left w:type="dxa" w:w="120"/>
@@ -3603,7 +3603,7 @@
               <w:bottom w:val="single" w:color="BFBFBF" w:sz="4"/>
               <w:right w:val="single" w:color="BFBFBF" w:sz="4"/>
             </w:tcBorders>
-            <w:shd w:fill="1F3864" w:val="clear"/>
+            <w:shd w:fill="1A5E20" w:val="clear"/>
             <w:tcMar>
               <w:top w:type="dxa" w:w="80"/>
               <w:left w:type="dxa" w:w="120"/>
@@ -3639,7 +3639,7 @@
               <w:bottom w:val="single" w:color="BFBFBF" w:sz="4"/>
               <w:right w:val="single" w:color="BFBFBF" w:sz="4"/>
             </w:tcBorders>
-            <w:shd w:fill="1F3864" w:val="clear"/>
+            <w:shd w:fill="1A5E20" w:val="clear"/>
             <w:tcMar>
               <w:top w:type="dxa" w:w="80"/>
               <w:left w:type="dxa" w:w="120"/>
@@ -4759,12 +4759,12 @@
           <w:tcPr>
             <w:tcW w:type="dxa" w:w="9360"/>
             <w:tcBorders>
-              <w:top w:val="single" w:color="2E75B6" w:sz="4"/>
-              <w:left w:val="single" w:color="2E75B6" w:sz="4"/>
-              <w:bottom w:val="single" w:color="2E75B6" w:sz="4"/>
-              <w:right w:val="single" w:color="2E75B6" w:sz="4"/>
-            </w:tcBorders>
-            <w:shd w:fill="E8F4FD" w:val="clear"/>
+              <w:top w:val="single" w:color="2E7D32" w:sz="4"/>
+              <w:left w:val="single" w:color="2E7D32" w:sz="4"/>
+              <w:bottom w:val="single" w:color="2E7D32" w:sz="4"/>
+              <w:right w:val="single" w:color="2E7D32" w:sz="4"/>
+            </w:tcBorders>
+            <w:shd w:fill="E8F5E9" w:val="clear"/>
             <w:tcMar>
               <w:top w:type="dxa" w:w="120"/>
               <w:left w:type="dxa" w:w="160"/>
@@ -4780,7 +4780,7 @@
               <w:rPr>
                 <w:b/>
                 <w:bCs/>
-                <w:color w:val="1F3864"/>
+                <w:color w:val="1A5E20"/>
                 <w:sz w:val="22"/>
                 <w:szCs w:val="22"/>
               </w:rPr>
@@ -5125,7 +5125,7 @@
               <w:bottom w:val="single" w:color="BFBFBF" w:sz="4"/>
               <w:right w:val="single" w:color="BFBFBF" w:sz="4"/>
             </w:tcBorders>
-            <w:shd w:fill="1F3864" w:val="clear"/>
+            <w:shd w:fill="1A5E20" w:val="clear"/>
             <w:tcMar>
               <w:top w:type="dxa" w:w="80"/>
               <w:left w:type="dxa" w:w="120"/>
@@ -5161,7 +5161,7 @@
               <w:bottom w:val="single" w:color="BFBFBF" w:sz="4"/>
               <w:right w:val="single" w:color="BFBFBF" w:sz="4"/>
             </w:tcBorders>
-            <w:shd w:fill="1F3864" w:val="clear"/>
+            <w:shd w:fill="1A5E20" w:val="clear"/>
             <w:tcMar>
               <w:top w:type="dxa" w:w="80"/>
               <w:left w:type="dxa" w:w="120"/>
@@ -8651,12 +8651,12 @@
           <w:tcPr>
             <w:tcW w:type="dxa" w:w="9360"/>
             <w:tcBorders>
-              <w:top w:val="single" w:color="2E75B6" w:sz="4"/>
-              <w:left w:val="single" w:color="2E75B6" w:sz="4"/>
-              <w:bottom w:val="single" w:color="2E75B6" w:sz="4"/>
-              <w:right w:val="single" w:color="2E75B6" w:sz="4"/>
-            </w:tcBorders>
-            <w:shd w:fill="E8F4FD" w:val="clear"/>
+              <w:top w:val="single" w:color="2E7D32" w:sz="4"/>
+              <w:left w:val="single" w:color="2E7D32" w:sz="4"/>
+              <w:bottom w:val="single" w:color="2E7D32" w:sz="4"/>
+              <w:right w:val="single" w:color="2E7D32" w:sz="4"/>
+            </w:tcBorders>
+            <w:shd w:fill="E8F5E9" w:val="clear"/>
             <w:tcMar>
               <w:top w:type="dxa" w:w="120"/>
               <w:left w:type="dxa" w:w="160"/>
@@ -8672,7 +8672,7 @@
               <w:rPr>
                 <w:b/>
                 <w:bCs/>
-                <w:color w:val="1F3864"/>
+                <w:color w:val="1A5E20"/>
                 <w:sz w:val="22"/>
                 <w:szCs w:val="22"/>
               </w:rPr>
@@ -8928,12 +8928,12 @@
           <w:tcPr>
             <w:tcW w:type="dxa" w:w="9360"/>
             <w:tcBorders>
-              <w:top w:val="single" w:color="2E75B6" w:sz="4"/>
-              <w:left w:val="single" w:color="2E75B6" w:sz="4"/>
-              <w:bottom w:val="single" w:color="2E75B6" w:sz="4"/>
-              <w:right w:val="single" w:color="2E75B6" w:sz="4"/>
-            </w:tcBorders>
-            <w:shd w:fill="E8F4FD" w:val="clear"/>
+              <w:top w:val="single" w:color="2E7D32" w:sz="4"/>
+              <w:left w:val="single" w:color="2E7D32" w:sz="4"/>
+              <w:bottom w:val="single" w:color="2E7D32" w:sz="4"/>
+              <w:right w:val="single" w:color="2E7D32" w:sz="4"/>
+            </w:tcBorders>
+            <w:shd w:fill="E8F5E9" w:val="clear"/>
             <w:tcMar>
               <w:top w:type="dxa" w:w="120"/>
               <w:left w:type="dxa" w:w="160"/>
@@ -8949,7 +8949,7 @@
               <w:rPr>
                 <w:b/>
                 <w:bCs/>
-                <w:color w:val="1F3864"/>
+                <w:color w:val="1A5E20"/>
                 <w:sz w:val="22"/>
                 <w:szCs w:val="22"/>
               </w:rPr>
@@ -9106,12 +9106,12 @@
           <w:tcPr>
             <w:tcW w:type="dxa" w:w="9360"/>
             <w:tcBorders>
-              <w:top w:val="single" w:color="2E75B6" w:sz="4"/>
-              <w:left w:val="single" w:color="2E75B6" w:sz="4"/>
-              <w:bottom w:val="single" w:color="2E75B6" w:sz="4"/>
-              <w:right w:val="single" w:color="2E75B6" w:sz="4"/>
-            </w:tcBorders>
-            <w:shd w:fill="E8F4FD" w:val="clear"/>
+              <w:top w:val="single" w:color="2E7D32" w:sz="4"/>
+              <w:left w:val="single" w:color="2E7D32" w:sz="4"/>
+              <w:bottom w:val="single" w:color="2E7D32" w:sz="4"/>
+              <w:right w:val="single" w:color="2E7D32" w:sz="4"/>
+            </w:tcBorders>
+            <w:shd w:fill="E8F5E9" w:val="clear"/>
             <w:tcMar>
               <w:top w:type="dxa" w:w="120"/>
               <w:left w:type="dxa" w:w="160"/>
@@ -9127,7 +9127,7 @@
               <w:rPr>
                 <w:b/>
                 <w:bCs/>
-                <w:color w:val="1F3864"/>
+                <w:color w:val="1A5E20"/>
                 <w:sz w:val="22"/>
                 <w:szCs w:val="22"/>
               </w:rPr>
@@ -9620,12 +9620,12 @@
           <w:tcPr>
             <w:tcW w:type="dxa" w:w="9360"/>
             <w:tcBorders>
-              <w:top w:val="single" w:color="2E75B6" w:sz="4"/>
-              <w:left w:val="single" w:color="2E75B6" w:sz="4"/>
-              <w:bottom w:val="single" w:color="2E75B6" w:sz="4"/>
-              <w:right w:val="single" w:color="2E75B6" w:sz="4"/>
-            </w:tcBorders>
-            <w:shd w:fill="E8F4FD" w:val="clear"/>
+              <w:top w:val="single" w:color="2E7D32" w:sz="4"/>
+              <w:left w:val="single" w:color="2E7D32" w:sz="4"/>
+              <w:bottom w:val="single" w:color="2E7D32" w:sz="4"/>
+              <w:right w:val="single" w:color="2E7D32" w:sz="4"/>
+            </w:tcBorders>
+            <w:shd w:fill="E8F5E9" w:val="clear"/>
             <w:tcMar>
               <w:top w:type="dxa" w:w="120"/>
               <w:left w:type="dxa" w:w="160"/>
@@ -9641,7 +9641,7 @@
               <w:rPr>
                 <w:b/>
                 <w:bCs/>
-                <w:color w:val="1F3864"/>
+                <w:color w:val="1A5E20"/>
                 <w:sz w:val="22"/>
                 <w:szCs w:val="22"/>
               </w:rPr>
@@ -9842,12 +9842,12 @@
           <w:tcPr>
             <w:tcW w:type="dxa" w:w="9360"/>
             <w:tcBorders>
-              <w:top w:val="single" w:color="2E75B6" w:sz="4"/>
-              <w:left w:val="single" w:color="2E75B6" w:sz="4"/>
-              <w:bottom w:val="single" w:color="2E75B6" w:sz="4"/>
-              <w:right w:val="single" w:color="2E75B6" w:sz="4"/>
-            </w:tcBorders>
-            <w:shd w:fill="E8F4FD" w:val="clear"/>
+              <w:top w:val="single" w:color="2E7D32" w:sz="4"/>
+              <w:left w:val="single" w:color="2E7D32" w:sz="4"/>
+              <w:bottom w:val="single" w:color="2E7D32" w:sz="4"/>
+              <w:right w:val="single" w:color="2E7D32" w:sz="4"/>
+            </w:tcBorders>
+            <w:shd w:fill="E8F5E9" w:val="clear"/>
             <w:tcMar>
               <w:top w:type="dxa" w:w="120"/>
               <w:left w:type="dxa" w:w="160"/>
@@ -9863,7 +9863,7 @@
               <w:rPr>
                 <w:b/>
                 <w:bCs/>
-                <w:color w:val="1F3864"/>
+                <w:color w:val="1A5E20"/>
                 <w:sz w:val="22"/>
                 <w:szCs w:val="22"/>
               </w:rPr>
@@ -10297,7 +10297,7 @@
               <w:bottom w:val="single" w:color="BFBFBF" w:sz="4"/>
               <w:right w:val="single" w:color="BFBFBF" w:sz="4"/>
             </w:tcBorders>
-            <w:shd w:fill="1F3864" w:val="clear"/>
+            <w:shd w:fill="1A5E20" w:val="clear"/>
             <w:tcMar>
               <w:top w:type="dxa" w:w="80"/>
               <w:left w:type="dxa" w:w="120"/>
@@ -10333,7 +10333,7 @@
               <w:bottom w:val="single" w:color="BFBFBF" w:sz="4"/>
               <w:right w:val="single" w:color="BFBFBF" w:sz="4"/>
             </w:tcBorders>
-            <w:shd w:fill="1F3864" w:val="clear"/>
+            <w:shd w:fill="1A5E20" w:val="clear"/>
             <w:tcMar>
               <w:top w:type="dxa" w:w="80"/>
               <w:left w:type="dxa" w:w="120"/>
@@ -10369,7 +10369,7 @@
               <w:bottom w:val="single" w:color="BFBFBF" w:sz="4"/>
               <w:right w:val="single" w:color="BFBFBF" w:sz="4"/>
             </w:tcBorders>
-            <w:shd w:fill="1F3864" w:val="clear"/>
+            <w:shd w:fill="1A5E20" w:val="clear"/>
             <w:tcMar>
               <w:top w:type="dxa" w:w="80"/>
               <w:left w:type="dxa" w:w="120"/>
@@ -11289,12 +11289,12 @@
           <w:tcPr>
             <w:tcW w:type="dxa" w:w="9360"/>
             <w:tcBorders>
-              <w:top w:val="single" w:color="2E75B6" w:sz="4"/>
-              <w:left w:val="single" w:color="2E75B6" w:sz="4"/>
-              <w:bottom w:val="single" w:color="2E75B6" w:sz="4"/>
-              <w:right w:val="single" w:color="2E75B6" w:sz="4"/>
-            </w:tcBorders>
-            <w:shd w:fill="E8F4FD" w:val="clear"/>
+              <w:top w:val="single" w:color="2E7D32" w:sz="4"/>
+              <w:left w:val="single" w:color="2E7D32" w:sz="4"/>
+              <w:bottom w:val="single" w:color="2E7D32" w:sz="4"/>
+              <w:right w:val="single" w:color="2E7D32" w:sz="4"/>
+            </w:tcBorders>
+            <w:shd w:fill="E8F5E9" w:val="clear"/>
             <w:tcMar>
               <w:top w:type="dxa" w:w="120"/>
               <w:left w:type="dxa" w:w="160"/>
@@ -11310,7 +11310,7 @@
               <w:rPr>
                 <w:b/>
                 <w:bCs/>
-                <w:color w:val="1F3864"/>
+                <w:color w:val="1A5E20"/>
                 <w:sz w:val="22"/>
                 <w:szCs w:val="22"/>
               </w:rPr>
@@ -11770,12 +11770,12 @@
           <w:tcPr>
             <w:tcW w:type="dxa" w:w="9360"/>
             <w:tcBorders>
-              <w:top w:val="single" w:color="2E75B6" w:sz="4"/>
-              <w:left w:val="single" w:color="2E75B6" w:sz="4"/>
-              <w:bottom w:val="single" w:color="2E75B6" w:sz="4"/>
-              <w:right w:val="single" w:color="2E75B6" w:sz="4"/>
-            </w:tcBorders>
-            <w:shd w:fill="E8F4FD" w:val="clear"/>
+              <w:top w:val="single" w:color="2E7D32" w:sz="4"/>
+              <w:left w:val="single" w:color="2E7D32" w:sz="4"/>
+              <w:bottom w:val="single" w:color="2E7D32" w:sz="4"/>
+              <w:right w:val="single" w:color="2E7D32" w:sz="4"/>
+            </w:tcBorders>
+            <w:shd w:fill="E8F5E9" w:val="clear"/>
             <w:tcMar>
               <w:top w:type="dxa" w:w="120"/>
               <w:left w:type="dxa" w:w="160"/>
@@ -11791,7 +11791,7 @@
               <w:rPr>
                 <w:b/>
                 <w:bCs/>
-                <w:color w:val="1F3864"/>
+                <w:color w:val="1A5E20"/>
                 <w:sz w:val="22"/>
                 <w:szCs w:val="22"/>
               </w:rPr>
@@ -11891,7 +11891,7 @@
               <w:bottom w:val="single" w:color="BFBFBF" w:sz="4"/>
               <w:right w:val="single" w:color="BFBFBF" w:sz="4"/>
             </w:tcBorders>
-            <w:shd w:fill="1F3864" w:val="clear"/>
+            <w:shd w:fill="1A5E20" w:val="clear"/>
             <w:tcMar>
               <w:top w:type="dxa" w:w="80"/>
               <w:left w:type="dxa" w:w="120"/>
@@ -11927,7 +11927,7 @@
               <w:bottom w:val="single" w:color="BFBFBF" w:sz="4"/>
               <w:right w:val="single" w:color="BFBFBF" w:sz="4"/>
             </w:tcBorders>
-            <w:shd w:fill="1F3864" w:val="clear"/>
+            <w:shd w:fill="1A5E20" w:val="clear"/>
             <w:tcMar>
               <w:top w:type="dxa" w:w="80"/>
               <w:left w:type="dxa" w:w="120"/>
@@ -11963,7 +11963,7 @@
               <w:bottom w:val="single" w:color="BFBFBF" w:sz="4"/>
               <w:right w:val="single" w:color="BFBFBF" w:sz="4"/>
             </w:tcBorders>
-            <w:shd w:fill="1F3864" w:val="clear"/>
+            <w:shd w:fill="1A5E20" w:val="clear"/>
             <w:tcMar>
               <w:top w:type="dxa" w:w="80"/>
               <w:left w:type="dxa" w:w="120"/>
@@ -13772,7 +13772,7 @@
               <w:bottom w:val="single" w:color="BFBFBF" w:sz="4"/>
               <w:right w:val="single" w:color="BFBFBF" w:sz="4"/>
             </w:tcBorders>
-            <w:shd w:fill="1F3864" w:val="clear"/>
+            <w:shd w:fill="1A5E20" w:val="clear"/>
             <w:tcMar>
               <w:top w:type="dxa" w:w="80"/>
               <w:left w:type="dxa" w:w="120"/>
@@ -13808,7 +13808,7 @@
               <w:bottom w:val="single" w:color="BFBFBF" w:sz="4"/>
               <w:right w:val="single" w:color="BFBFBF" w:sz="4"/>
             </w:tcBorders>
-            <w:shd w:fill="1F3864" w:val="clear"/>
+            <w:shd w:fill="1A5E20" w:val="clear"/>
             <w:tcMar>
               <w:top w:type="dxa" w:w="80"/>
               <w:left w:type="dxa" w:w="120"/>
@@ -15442,7 +15442,7 @@
               <w:bottom w:val="single" w:color="BFBFBF" w:sz="4"/>
               <w:right w:val="single" w:color="BFBFBF" w:sz="4"/>
             </w:tcBorders>
-            <w:shd w:fill="1F3864" w:val="clear"/>
+            <w:shd w:fill="1A5E20" w:val="clear"/>
             <w:tcMar>
               <w:top w:type="dxa" w:w="80"/>
               <w:left w:type="dxa" w:w="120"/>
@@ -15478,7 +15478,7 @@
               <w:bottom w:val="single" w:color="BFBFBF" w:sz="4"/>
               <w:right w:val="single" w:color="BFBFBF" w:sz="4"/>
             </w:tcBorders>
-            <w:shd w:fill="1F3864" w:val="clear"/>
+            <w:shd w:fill="1A5E20" w:val="clear"/>
             <w:tcMar>
               <w:top w:type="dxa" w:w="80"/>
               <w:left w:type="dxa" w:w="120"/>
@@ -17546,7 +17546,7 @@
     <w:next w:val="Normal"/>
     <w:qFormat/>
     <w:rPr>
-      <w:color w:val="2E74B5"/>
+      <w:color w:val="2E7D32"/>
       <w:sz w:val="32"/>
       <w:szCs w:val="32"/>
     </w:rPr>
@@ -17557,7 +17557,7 @@
     <w:next w:val="Normal"/>
     <w:qFormat/>
     <w:rPr>
-      <w:color w:val="2E74B5"/>
+      <w:color w:val="2E7D32"/>
       <w:sz w:val="26"/>
       <w:szCs w:val="26"/>
     </w:rPr>
@@ -17568,7 +17568,7 @@
     <w:next w:val="Normal"/>
     <w:qFormat/>
     <w:rPr>
-      <w:color w:val="1F4D78"/>
+      <w:color w:val="1B5E20"/>
       <w:sz w:val="24"/>
       <w:szCs w:val="24"/>
     </w:rPr>
@@ -17581,7 +17581,7 @@
     <w:rPr>
       <w:i/>
       <w:iCs/>
-      <w:color w:val="2E74B5"/>
+      <w:color w:val="2E7D32"/>
     </w:rPr>
   </w:style>
   <w:style w:type="paragraph" w:styleId="Heading5">
@@ -17590,7 +17590,7 @@
     <w:next w:val="Normal"/>
     <w:qFormat/>
     <w:rPr>
-      <w:color w:val="2E74B5"/>
+      <w:color w:val="2E7D32"/>
     </w:rPr>
   </w:style>
   <w:style w:type="paragraph" w:styleId="Heading6">
@@ -17599,7 +17599,7 @@
     <w:next w:val="Normal"/>
     <w:qFormat/>
     <w:rPr>
-      <w:color w:val="1F4D78"/>
+      <w:color w:val="1B5E20"/>
     </w:rPr>
   </w:style>
   <w:style w:type="paragraph" w:styleId="Strong">
@@ -17623,7 +17623,7 @@
     <w:uiPriority w:val="99"/>
     <w:unhideWhenUsed/>
     <w:rPr>
-      <w:color w:val="0563C1"/>
+      <w:color w:val="1A7A2B"/>
       <w:u w:val="single"/>
     </w:rPr>
   </w:style>
@@ -17708,7 +17708,7 @@
     <w:qFormat/>
     <w:pPr>
       <w:pBdr>
-        <w:bottom w:val="single" w:color="1F3864" w:sz="8" w:space="4"/>
+        <w:bottom w:val="single" w:color="1A5E20" w:sz="8" w:space="4"/>
       </w:pBdr>
       <w:spacing w:after="220" w:before="320"/>
       <w:outlineLvl w:val="0"/>
@@ -17717,7 +17717,7 @@
       <w:rFonts w:ascii="Arial" w:cs="Arial" w:eastAsia="Arial" w:hAnsi="Arial"/>
       <w:b/>
       <w:bCs/>
-      <w:color w:val="1F3864"/>
+      <w:color w:val="1A5E20"/>
       <w:sz w:val="30"/>
       <w:szCs w:val="30"/>
     </w:rPr>
@@ -17735,7 +17735,7 @@
       <w:rFonts w:ascii="Arial" w:cs="Arial" w:eastAsia="Arial" w:hAnsi="Arial"/>
       <w:b/>
       <w:bCs/>
-      <w:color w:val="2E75B6"/>
+      <w:color w:val="2E7D32"/>
       <w:sz w:val="25"/>
       <w:szCs w:val="25"/>
     </w:rPr>

</xml_diff>

<commit_message>
Add CPP102 Week 3 assessment module, batches, and answer keys; update Week 1 and Week 2 modules
</commit_message>
<xml_diff>
--- a/CPP102-Programming-Logic-and-Design/Week01/CPP102_Week1_Lecture_Lab_Module.docx
+++ b/CPP102-Programming-Logic-and-Design/Week01/CPP102_Week1_Lecture_Lab_Module.docx
@@ -4,73 +4,65 @@
   <w:body>
     <w:p>
       <w:pPr>
-        <w:spacing w:after="80"/>
+        <w:spacing w:after="120" w:before="720"/>
         <w:jc w:val="center"/>
       </w:pPr>
       <w:r>
         <w:rPr>
+          <w:rFonts w:ascii="Arial" w:cs="Arial" w:eastAsia="Arial" w:hAnsi="Arial"/>
           <w:b/>
           <w:bCs/>
-          <w:color w:val="1A5E20"/>
-          <w:sz w:val="32"/>
-          <w:szCs w:val="32"/>
+          <w:color w:val="1B5E20"/>
+          <w:sz w:val="36"/>
+          <w:szCs w:val="36"/>
         </w:rPr>
         <w:t xml:space="preserve">CPP102: PROGRAMMING LOGIC AND DESIGN</w:t>
       </w:r>
     </w:p>
     <w:p>
       <w:pPr>
-        <w:spacing w:after="80"/>
+        <w:spacing w:after="120"/>
         <w:jc w:val="center"/>
       </w:pPr>
       <w:r>
         <w:rPr>
+          <w:rFonts w:ascii="Arial" w:cs="Arial" w:eastAsia="Arial" w:hAnsi="Arial"/>
           <w:b/>
           <w:bCs/>
+          <w:sz w:val="28"/>
+          <w:szCs w:val="28"/>
+        </w:rPr>
+        <w:t xml:space="preserve">Week 1 Lecture and Laboratory Module</w:t>
+      </w:r>
+    </w:p>
+    <w:p>
+      <w:pPr>
+        <w:spacing w:after="120"/>
+        <w:jc w:val="center"/>
+      </w:pPr>
+      <w:r>
+        <w:rPr>
+          <w:rFonts w:ascii="Arial" w:cs="Arial" w:eastAsia="Arial" w:hAnsi="Arial"/>
+          <w:i/>
+          <w:iCs/>
           <w:sz w:val="26"/>
           <w:szCs w:val="26"/>
         </w:rPr>
-        <w:t xml:space="preserve">Week 1 Lecture and Laboratory Module (Revised)</w:t>
-      </w:r>
-    </w:p>
-    <w:p>
-      <w:pPr>
-        <w:spacing w:after="80"/>
+        <w:t xml:space="preserve">Introduction to Programming Languages; Introduction to Git and GitHub</w:t>
+      </w:r>
+    </w:p>
+    <w:p>
+      <w:pPr>
+        <w:spacing w:after="960"/>
         <w:jc w:val="center"/>
       </w:pPr>
       <w:r>
         <w:rPr>
-          <w:i/>
-          <w:iCs/>
-          <w:sz w:val="22"/>
-          <w:szCs w:val="22"/>
-        </w:rPr>
-        <w:t xml:space="preserve">Introduction to Programming Languages; Introduction to Git and GitHub (Overview)</w:t>
-      </w:r>
-    </w:p>
-    <w:p>
-      <w:pPr>
-        <w:spacing w:after="300"/>
-        <w:jc w:val="center"/>
-      </w:pPr>
-      <w:r>
-        <w:rPr>
-          <w:color w:val="595959"/>
-          <w:sz w:val="20"/>
-          <w:szCs w:val="20"/>
+          <w:rFonts w:ascii="Arial" w:cs="Arial" w:eastAsia="Arial" w:hAnsi="Arial"/>
+          <w:sz w:val="24"/>
+          <w:szCs w:val="24"/>
         </w:rPr>
         <w:t xml:space="preserve">Department of Computer Engineering</w:t>
-      </w:r>
-    </w:p>
-    <w:p>
-      <w:pPr>
-        <w:pBdr>
-          <w:bottom w:val="single" w:color="2E7D32" w:sz="6" w:space="1"/>
-        </w:pBdr>
-        <w:spacing w:after="200" w:before="80"/>
-      </w:pPr>
-      <w:r>
-        <w:t xml:space="preserve"/>
       </w:r>
     </w:p>
     <w:p>
@@ -294,7 +286,7 @@
           <w:sz w:val="22"/>
           <w:szCs w:val="22"/>
         </w:rPr>
-        <w:t xml:space="preserve">Commonly used Git commands: git init, git status, git add, git commit, git push</w:t>
+        <w:t xml:space="preserve">Commonly used Git commands: git init, git status, git add, git commit, git push, git pull</w:t>
       </w:r>
     </w:p>
     <w:p>
@@ -505,6 +497,12 @@
           <w:szCs w:val="22"/>
         </w:rPr>
         <w:t xml:space="preserve">stage, commit, and push files to a GitHub repository.</w:t>
+      </w:r>
+    </w:p>
+    <w:p>
+      <w:r>
+        <w:rPr/>
+        <w:t>use git pull to download the latest changes from GitHub before editing.</w:t>
       </w:r>
     </w:p>
     <w:p>
@@ -4722,6 +4720,86 @@
           </w:p>
         </w:tc>
       </w:tr>
+      <w:tr>
+        <w:tc>
+          <w:tcPr>
+            <w:tcW w:type="dxa" w:w="3400"/>
+            <w:tcBorders>
+              <w:top w:val="single" w:color="BFBFBF" w:sz="4"/>
+              <w:left w:val="single" w:color="BFBFBF" w:sz="4"/>
+              <w:bottom w:val="single" w:color="BFBFBF" w:sz="4"/>
+              <w:right w:val="single" w:color="BFBFBF" w:sz="4"/>
+            </w:tcBorders>
+            <w:shd w:fill="F2F2F2" w:val="clear"/>
+            <w:tcMar>
+              <w:top w:type="dxa" w:w="80"/>
+              <w:left w:type="dxa" w:w="120"/>
+              <w:bottom w:type="dxa" w:w="80"/>
+              <w:right w:type="dxa" w:w="120"/>
+            </w:tcMar>
+            <w:vAlign w:val="center"/>
+          </w:tcPr>
+          <w:p>
+            <w:r>
+              <w:rPr>
+                <w:b/>
+                <w:rFonts w:ascii="Courier New" w:hAnsi="Courier New"/>
+              </w:rPr>
+              <w:t>git pull</w:t>
+            </w:r>
+          </w:p>
+        </w:tc>
+        <w:tc>
+          <w:tcPr>
+            <w:tcW w:type="dxa" w:w="4000"/>
+            <w:tcBorders>
+              <w:top w:val="single" w:color="BFBFBF" w:sz="4"/>
+              <w:left w:val="single" w:color="BFBFBF" w:sz="4"/>
+              <w:bottom w:val="single" w:color="BFBFBF" w:sz="4"/>
+              <w:right w:val="single" w:color="BFBFBF" w:sz="4"/>
+            </w:tcBorders>
+            <w:shd w:fill="F2F2F2" w:val="clear"/>
+            <w:tcMar>
+              <w:top w:type="dxa" w:w="80"/>
+              <w:left w:type="dxa" w:w="120"/>
+              <w:bottom w:type="dxa" w:w="80"/>
+              <w:right w:type="dxa" w:w="120"/>
+            </w:tcMar>
+            <w:vAlign w:val="center"/>
+          </w:tcPr>
+          <w:p>
+            <w:r>
+              <w:rPr/>
+              <w:t>Downloads the latest changes from the connected GitHub repository to the local project folder. Running git pull before editing ensures the local folder is synchronized with GitHub and reduces the chance of push errors.</w:t>
+            </w:r>
+          </w:p>
+        </w:tc>
+        <w:tc>
+          <w:tcPr>
+            <w:tcW w:type="dxa" w:w="1960"/>
+            <w:tcBorders>
+              <w:top w:val="single" w:color="BFBFBF" w:sz="4"/>
+              <w:left w:val="single" w:color="BFBFBF" w:sz="4"/>
+              <w:bottom w:val="single" w:color="BFBFBF" w:sz="4"/>
+              <w:right w:val="single" w:color="BFBFBF" w:sz="4"/>
+            </w:tcBorders>
+            <w:shd w:fill="F2F2F2" w:val="clear"/>
+            <w:tcMar>
+              <w:top w:type="dxa" w:w="80"/>
+              <w:left w:type="dxa" w:w="120"/>
+              <w:bottom w:type="dxa" w:w="80"/>
+              <w:right w:type="dxa" w:w="120"/>
+            </w:tcMar>
+            <w:vAlign w:val="center"/>
+          </w:tcPr>
+          <w:p>
+            <w:r>
+              <w:rPr/>
+              <w:t>Before starting any editing session, especially if files may have been changed on GitHub, from another computer, or by another group member.</w:t>
+            </w:r>
+          </w:p>
+        </w:tc>
+      </w:tr>
     </w:tbl>
     <w:p>
       <w:pPr>
@@ -4826,6 +4904,198 @@
         </w:tc>
       </w:tr>
     </w:tbl>
+    <w:p/>
+    <w:tbl>
+      <w:tblPr>
+        <w:tblW w:w="8920" w:type="dxa"/>
+        <w:tblBorders>
+          <w:top w:val="single" w:sz="6" w:color="1A5E20"/>
+          <w:left w:val="single" w:sz="6" w:color="1A5E20"/>
+          <w:bottom w:val="single" w:sz="6" w:color="1A5E20"/>
+          <w:right w:val="single" w:sz="6" w:color="1A5E20"/>
+        </w:tblBorders>
+      </w:tblPr>
+      <w:tblGrid>
+        <w:gridCol w:w="8920"/>
+      </w:tblGrid>
+      <w:tr>
+        <w:tc>
+          <w:tcPr>
+            <w:tcW w:w="8920" w:type="dxa"/>
+            <w:shd w:val="clear" w:fill="E8F5E9"/>
+          </w:tcPr>
+          <w:p>
+            <w:r>
+              <w:rPr>
+                <w:b/>
+              </w:rPr>
+              <w:t>Important Rule: Always PULL Before You START. Always COMMIT Before You PUSH.</w:t>
+            </w:r>
+          </w:p>
+          <w:p>
+            <w:r>
+              <w:t/>
+            </w:r>
+          </w:p>
+          <w:p>
+            <w:r>
+              <w:t>Before editing files in VS Code, always run:</w:t>
+            </w:r>
+          </w:p>
+          <w:p>
+            <w:r>
+              <w:t xml:space="preserve">    git pull</w:t>
+            </w:r>
+          </w:p>
+          <w:p>
+            <w:r>
+              <w:t/>
+            </w:r>
+          </w:p>
+          <w:p>
+            <w:r>
+              <w:t>After editing files in VS Code, always run:</w:t>
+            </w:r>
+          </w:p>
+          <w:p>
+            <w:r>
+              <w:t xml:space="preserve">    git status</w:t>
+            </w:r>
+          </w:p>
+          <w:p>
+            <w:r>
+              <w:t xml:space="preserve">    git add .</w:t>
+            </w:r>
+          </w:p>
+          <w:p>
+            <w:r>
+              <w:t xml:space="preserve">    git commit -m "brief description of your changes"</w:t>
+            </w:r>
+          </w:p>
+          <w:p>
+            <w:r>
+              <w:t xml:space="preserve">    git push</w:t>
+            </w:r>
+          </w:p>
+          <w:p>
+            <w:r>
+              <w:t/>
+            </w:r>
+          </w:p>
+          <w:p>
+            <w:r>
+              <w:t>This routine keeps the local folder and GitHub repository synchronized.</w:t>
+            </w:r>
+          </w:p>
+        </w:tc>
+      </w:tr>
+    </w:tbl>
+    <w:p/>
+    <w:tbl>
+      <w:tblPr>
+        <w:tblW w:w="8920" w:type="dxa"/>
+        <w:tblBorders>
+          <w:top w:val="single" w:sz="6" w:color="F57F17"/>
+          <w:left w:val="single" w:sz="6" w:color="F57F17"/>
+          <w:bottom w:val="single" w:sz="6" w:color="F57F17"/>
+          <w:right w:val="single" w:sz="6" w:color="F57F17"/>
+        </w:tblBorders>
+      </w:tblPr>
+      <w:tblGrid>
+        <w:gridCol w:w="8920"/>
+      </w:tblGrid>
+      <w:tr>
+        <w:tc>
+          <w:tcPr>
+            <w:tcW w:w="8920" w:type="dxa"/>
+            <w:shd w:val="clear" w:fill="FFF8E1"/>
+          </w:tcPr>
+          <w:p>
+            <w:r>
+              <w:rPr>
+                <w:b/>
+              </w:rPr>
+              <w:t>Warning: Avoid Editing Directly on GitHub</w:t>
+            </w:r>
+          </w:p>
+          <w:p>
+            <w:r>
+              <w:t/>
+            </w:r>
+          </w:p>
+          <w:p>
+            <w:r>
+              <w:t>Students should normally edit files in VS Code, not directly on the GitHub website.</w:t>
+            </w:r>
+          </w:p>
+          <w:p>
+            <w:r>
+              <w:t/>
+            </w:r>
+          </w:p>
+          <w:p>
+            <w:r>
+              <w:t>If a file is edited directly on GitHub, a subsequent push from VS Code may fail with:</w:t>
+            </w:r>
+          </w:p>
+          <w:p>
+            <w:r>
+              <w:t xml:space="preserve">    error: failed to push some refs</w:t>
+            </w:r>
+          </w:p>
+          <w:p>
+            <w:r>
+              <w:t/>
+            </w:r>
+          </w:p>
+          <w:p>
+            <w:r>
+              <w:t>Cause: The GitHub repository has a newer version not yet in the local folder.</w:t>
+            </w:r>
+          </w:p>
+          <w:p>
+            <w:r>
+              <w:t/>
+            </w:r>
+          </w:p>
+          <w:p>
+            <w:r>
+              <w:t>Fix:</w:t>
+            </w:r>
+          </w:p>
+          <w:p>
+            <w:r>
+              <w:t xml:space="preserve">    git pull origin main</w:t>
+            </w:r>
+          </w:p>
+          <w:p>
+            <w:r>
+              <w:t xml:space="preserve">    git push origin main</w:t>
+            </w:r>
+          </w:p>
+          <w:p>
+            <w:r>
+              <w:t/>
+            </w:r>
+          </w:p>
+          <w:p>
+            <w:r>
+              <w:t>Or, if the branch upstream is already configured:</w:t>
+            </w:r>
+          </w:p>
+          <w:p>
+            <w:r>
+              <w:t xml:space="preserve">    git pull</w:t>
+            </w:r>
+          </w:p>
+          <w:p>
+            <w:r>
+              <w:t xml:space="preserve">    git push</w:t>
+            </w:r>
+          </w:p>
+        </w:tc>
+      </w:tr>
+    </w:tbl>
     <w:p>
       <w:pPr>
         <w:spacing w:after="80"/>
@@ -5083,6 +5353,46 @@
                 <w:szCs w:val="20"/>
               </w:rPr>
               <w:t xml:space="preserve">git push -u origin main</w:t>
+            </w:r>
+          </w:p>
+          <w:p>
+            <w:r>
+              <w:rPr>
+                <w:rFonts w:ascii="Consolas" w:cs="Consolas" w:eastAsia="Consolas" w:hAnsi="Consolas"/>
+                <w:sz w:val="20"/>
+                <w:szCs w:val="20"/>
+              </w:rPr>
+              <w:t/>
+            </w:r>
+          </w:p>
+          <w:p>
+            <w:r>
+              <w:rPr>
+                <w:rFonts w:ascii="Consolas" w:cs="Consolas" w:eastAsia="Consolas" w:hAnsi="Consolas"/>
+                <w:sz w:val="20"/>
+                <w:szCs w:val="20"/>
+              </w:rPr>
+              <w:t>Regular workflow for all sessions after the first setup:</w:t>
+            </w:r>
+          </w:p>
+          <w:p>
+            <w:r>
+              <w:rPr>
+                <w:rFonts w:ascii="Consolas" w:cs="Consolas" w:eastAsia="Consolas" w:hAnsi="Consolas"/>
+                <w:sz w:val="20"/>
+                <w:szCs w:val="20"/>
+              </w:rPr>
+              <w:t xml:space="preserve">  Before editing:  git pull</w:t>
+            </w:r>
+          </w:p>
+          <w:p>
+            <w:r>
+              <w:rPr>
+                <w:rFonts w:ascii="Consolas" w:cs="Consolas" w:eastAsia="Consolas" w:hAnsi="Consolas"/>
+                <w:sz w:val="20"/>
+                <w:szCs w:val="20"/>
+              </w:rPr>
+              <w:t xml:space="preserve">  After editing:   git status  →  git add .  →  git commit -m "message"  →  git push</w:t>
             </w:r>
           </w:p>
         </w:tc>
@@ -11134,6 +11444,232 @@
           </w:p>
         </w:tc>
       </w:tr>
+      <w:tr>
+        <w:tc>
+          <w:tcPr>
+            <w:tcW w:type="dxa" w:w="3200"/>
+            <w:tcBorders>
+              <w:top w:val="single" w:color="BFBFBF" w:sz="4"/>
+              <w:left w:val="single" w:color="BFBFBF" w:sz="4"/>
+              <w:bottom w:val="single" w:color="BFBFBF" w:sz="4"/>
+              <w:right w:val="single" w:color="BFBFBF" w:sz="4"/>
+            </w:tcBorders>
+            <w:tcMar>
+              <w:top w:type="dxa" w:w="80"/>
+              <w:left w:type="dxa" w:w="120"/>
+              <w:bottom w:type="dxa" w:w="80"/>
+              <w:right w:type="dxa" w:w="120"/>
+            </w:tcMar>
+            <w:vAlign w:val="center"/>
+          </w:tcPr>
+          <w:p>
+            <w:r>
+              <w:rPr>
+                <w:b/>
+                <w:rFonts w:ascii="Courier New" w:hAnsi="Courier New"/>
+              </w:rPr>
+              <w:t>error: failed to push some refs</w:t>
+            </w:r>
+          </w:p>
+        </w:tc>
+        <w:tc>
+          <w:tcPr>
+            <w:tcW w:type="dxa" w:w="3200"/>
+            <w:tcBorders>
+              <w:top w:val="single" w:color="BFBFBF" w:sz="4"/>
+              <w:left w:val="single" w:color="BFBFBF" w:sz="4"/>
+              <w:bottom w:val="single" w:color="BFBFBF" w:sz="4"/>
+              <w:right w:val="single" w:color="BFBFBF" w:sz="4"/>
+            </w:tcBorders>
+            <w:tcMar>
+              <w:top w:type="dxa" w:w="80"/>
+              <w:left w:type="dxa" w:w="120"/>
+              <w:bottom w:type="dxa" w:w="80"/>
+              <w:right w:type="dxa" w:w="120"/>
+            </w:tcMar>
+            <w:vAlign w:val="center"/>
+          </w:tcPr>
+          <w:p>
+            <w:r>
+              <w:rPr/>
+              <w:t>The GitHub repository has changes not yet in the local folder. Usually happens after editing directly on GitHub, using another computer, or another group member pushing first.</w:t>
+            </w:r>
+          </w:p>
+        </w:tc>
+        <w:tc>
+          <w:tcPr>
+            <w:tcW w:type="dxa" w:w="2960"/>
+            <w:tcBorders>
+              <w:top w:val="single" w:color="BFBFBF" w:sz="4"/>
+              <w:left w:val="single" w:color="BFBFBF" w:sz="4"/>
+              <w:bottom w:val="single" w:color="BFBFBF" w:sz="4"/>
+              <w:right w:val="single" w:color="BFBFBF" w:sz="4"/>
+            </w:tcBorders>
+            <w:tcMar>
+              <w:top w:type="dxa" w:w="80"/>
+              <w:left w:type="dxa" w:w="120"/>
+              <w:bottom w:type="dxa" w:w="80"/>
+              <w:right w:type="dxa" w:w="120"/>
+            </w:tcMar>
+            <w:vAlign w:val="center"/>
+          </w:tcPr>
+          <w:p>
+            <w:r>
+              <w:rPr/>
+              <w:t>Run:</w:t>
+            </w:r>
+          </w:p>
+          <w:p>
+            <w:r>
+              <w:rPr/>
+              <w:t xml:space="preserve">    git pull origin main</w:t>
+            </w:r>
+          </w:p>
+          <w:p>
+            <w:r>
+              <w:rPr/>
+              <w:t>Then:</w:t>
+            </w:r>
+          </w:p>
+          <w:p>
+            <w:r>
+              <w:rPr/>
+              <w:t xml:space="preserve">    git push origin main</w:t>
+            </w:r>
+          </w:p>
+          <w:p>
+            <w:r>
+              <w:rPr/>
+              <w:t/>
+            </w:r>
+          </w:p>
+          <w:p>
+            <w:r>
+              <w:rPr/>
+              <w:t>If a merge conflict appears, stop and ask the instructor for help.</w:t>
+            </w:r>
+          </w:p>
+        </w:tc>
+      </w:tr>
+      <w:tr>
+        <w:tc>
+          <w:tcPr>
+            <w:tcW w:type="dxa" w:w="3200"/>
+            <w:tcBorders>
+              <w:top w:val="single" w:color="BFBFBF" w:sz="4"/>
+              <w:left w:val="single" w:color="BFBFBF" w:sz="4"/>
+              <w:bottom w:val="single" w:color="BFBFBF" w:sz="4"/>
+              <w:right w:val="single" w:color="BFBFBF" w:sz="4"/>
+            </w:tcBorders>
+            <w:tcMar>
+              <w:top w:type="dxa" w:w="80"/>
+              <w:left w:type="dxa" w:w="120"/>
+              <w:bottom w:type="dxa" w:w="80"/>
+              <w:right w:type="dxa" w:w="120"/>
+            </w:tcMar>
+            <w:vAlign w:val="center"/>
+          </w:tcPr>
+          <w:p>
+            <w:r>
+              <w:rPr>
+                <w:b/>
+                <w:rFonts w:ascii="Courier New" w:hAnsi="Courier New"/>
+              </w:rPr>
+              <w:t>Git pushes using wrong GitHub account</w:t>
+            </w:r>
+          </w:p>
+        </w:tc>
+        <w:tc>
+          <w:tcPr>
+            <w:tcW w:type="dxa" w:w="3200"/>
+            <w:tcBorders>
+              <w:top w:val="single" w:color="BFBFBF" w:sz="4"/>
+              <w:left w:val="single" w:color="BFBFBF" w:sz="4"/>
+              <w:bottom w:val="single" w:color="BFBFBF" w:sz="4"/>
+              <w:right w:val="single" w:color="BFBFBF" w:sz="4"/>
+            </w:tcBorders>
+            <w:tcMar>
+              <w:top w:type="dxa" w:w="80"/>
+              <w:left w:type="dxa" w:w="120"/>
+              <w:bottom w:type="dxa" w:w="80"/>
+              <w:right w:type="dxa" w:w="120"/>
+            </w:tcMar>
+            <w:vAlign w:val="center"/>
+          </w:tcPr>
+          <w:p>
+            <w:r>
+              <w:rPr/>
+              <w:t>A previous GitHub account may be saved in Windows Credential Manager. Git or VS Code uses that saved credential instead of the correct one.</w:t>
+            </w:r>
+          </w:p>
+        </w:tc>
+        <w:tc>
+          <w:tcPr>
+            <w:tcW w:type="dxa" w:w="2960"/>
+            <w:tcBorders>
+              <w:top w:val="single" w:color="BFBFBF" w:sz="4"/>
+              <w:left w:val="single" w:color="BFBFBF" w:sz="4"/>
+              <w:bottom w:val="single" w:color="BFBFBF" w:sz="4"/>
+              <w:right w:val="single" w:color="BFBFBF" w:sz="4"/>
+            </w:tcBorders>
+            <w:tcMar>
+              <w:top w:type="dxa" w:w="80"/>
+              <w:left w:type="dxa" w:w="120"/>
+              <w:bottom w:type="dxa" w:w="80"/>
+              <w:right w:type="dxa" w:w="120"/>
+            </w:tcMar>
+            <w:vAlign w:val="center"/>
+          </w:tcPr>
+          <w:p>
+            <w:r>
+              <w:rPr/>
+              <w:t>1. Open Windows Credential Manager.</w:t>
+            </w:r>
+          </w:p>
+          <w:p>
+            <w:r>
+              <w:rPr/>
+              <w:t>2. Go to Windows Credentials.</w:t>
+            </w:r>
+          </w:p>
+          <w:p>
+            <w:r>
+              <w:rPr/>
+              <w:t>3. Find and remove the saved GitHub credential.</w:t>
+            </w:r>
+          </w:p>
+          <w:p>
+            <w:r>
+              <w:rPr/>
+              <w:t>4. In VS Code Terminal, run:</w:t>
+            </w:r>
+          </w:p>
+          <w:p>
+            <w:r>
+              <w:rPr/>
+              <w:t xml:space="preserve">    git push origin main</w:t>
+            </w:r>
+          </w:p>
+          <w:p>
+            <w:r>
+              <w:rPr/>
+              <w:t>5. Log in with the correct account when prompted.</w:t>
+            </w:r>
+          </w:p>
+          <w:p>
+            <w:r>
+              <w:rPr/>
+              <w:t/>
+            </w:r>
+          </w:p>
+          <w:p>
+            <w:r>
+              <w:rPr/>
+              <w:t>Note: git config user.name changes the commit identity, not the authentication account.</w:t>
+            </w:r>
+          </w:p>
+        </w:tc>
+      </w:tr>
     </w:tbl>
     <w:p>
       <w:pPr>
@@ -11837,6 +12373,390 @@
         </w:tc>
       </w:tr>
     </w:tbl>
+    <w:p/>
+    <w:tbl>
+      <w:tblPr>
+        <w:tblW w:w="8920" w:type="dxa"/>
+        <w:tblBorders>
+          <w:top w:val="single" w:sz="6" w:color="E65100"/>
+          <w:left w:val="single" w:sz="6" w:color="E65100"/>
+          <w:bottom w:val="single" w:sz="6" w:color="E65100"/>
+          <w:right w:val="single" w:sz="6" w:color="E65100"/>
+        </w:tblBorders>
+      </w:tblPr>
+      <w:tblGrid>
+        <w:gridCol w:w="8920"/>
+      </w:tblGrid>
+      <w:tr>
+        <w:tc>
+          <w:tcPr>
+            <w:tcW w:w="8920" w:type="dxa"/>
+            <w:shd w:val="clear" w:fill="FFF3E0"/>
+          </w:tcPr>
+          <w:p>
+            <w:r>
+              <w:rPr>
+                <w:b/>
+              </w:rPr>
+              <w:t>What if a Merge Conflict Happens?</w:t>
+            </w:r>
+          </w:p>
+          <w:p>
+            <w:r>
+              <w:t/>
+            </w:r>
+          </w:p>
+          <w:p>
+            <w:r>
+              <w:t>A merge conflict happens when Git cannot automatically decide which version of a file to keep.</w:t>
+            </w:r>
+          </w:p>
+          <w:p>
+            <w:r>
+              <w:t>For Week 1, students are not expected to resolve complex conflicts alone.</w:t>
+            </w:r>
+          </w:p>
+          <w:p>
+            <w:r>
+              <w:t/>
+            </w:r>
+          </w:p>
+          <w:p>
+            <w:r>
+              <w:t>If you see markers like these inside a file:</w:t>
+            </w:r>
+          </w:p>
+          <w:p>
+            <w:r>
+              <w:t xml:space="preserve">    &lt;&lt;&lt;&lt;&lt;&lt;&lt; HEAD</w:t>
+            </w:r>
+          </w:p>
+          <w:p>
+            <w:r>
+              <w:t xml:space="preserve">    (local version)</w:t>
+            </w:r>
+          </w:p>
+          <w:p>
+            <w:r>
+              <w:t xml:space="preserve">    =======</w:t>
+            </w:r>
+          </w:p>
+          <w:p>
+            <w:r>
+              <w:t xml:space="preserve">    (GitHub version)</w:t>
+            </w:r>
+          </w:p>
+          <w:p>
+            <w:r>
+              <w:t xml:space="preserve">    &gt;&gt;&gt;&gt;&gt;&gt;&gt; origin/main</w:t>
+            </w:r>
+          </w:p>
+          <w:p>
+            <w:r>
+              <w:t/>
+            </w:r>
+          </w:p>
+          <w:p>
+            <w:r>
+              <w:t>Stop. Do not edit the file. Inform your instructor or laboratory assistant immediately.</w:t>
+            </w:r>
+          </w:p>
+        </w:tc>
+      </w:tr>
+    </w:tbl>
+    <w:p/>
+    <w:tbl>
+      <w:tblPr>
+        <w:tblW w:w="8920" w:type="dxa"/>
+        <w:tblBorders>
+          <w:top w:val="single" w:sz="6" w:color="2E7D32"/>
+          <w:left w:val="single" w:sz="6" w:color="2E7D32"/>
+          <w:bottom w:val="single" w:sz="6" w:color="2E7D32"/>
+          <w:right w:val="single" w:sz="6" w:color="2E7D32"/>
+        </w:tblBorders>
+      </w:tblPr>
+      <w:tblGrid>
+        <w:gridCol w:w="8920"/>
+      </w:tblGrid>
+      <w:tr>
+        <w:tc>
+          <w:tcPr>
+            <w:tcW w:w="8920" w:type="dxa"/>
+            <w:shd w:val="clear" w:fill="E8F5E9"/>
+          </w:tcPr>
+          <w:p>
+            <w:r>
+              <w:rPr>
+                <w:b/>
+              </w:rPr>
+              <w:t>Git Identity vs. GitHub Login Credential</w:t>
+            </w:r>
+          </w:p>
+          <w:p>
+            <w:r>
+              <w:t/>
+            </w:r>
+          </w:p>
+          <w:p>
+            <w:r>
+              <w:t>Git identity (what appears inside commits):</w:t>
+            </w:r>
+          </w:p>
+          <w:p>
+            <w:r>
+              <w:t xml:space="preserve">    git config --global user.name "Your Name"</w:t>
+            </w:r>
+          </w:p>
+          <w:p>
+            <w:r>
+              <w:t xml:space="preserve">    git config --global user.email "your_email@example.com"</w:t>
+            </w:r>
+          </w:p>
+          <w:p>
+            <w:r>
+              <w:t xml:space="preserve">    These do NOT control which GitHub account authenticates the push.</w:t>
+            </w:r>
+          </w:p>
+          <w:p>
+            <w:r>
+              <w:t/>
+            </w:r>
+          </w:p>
+          <w:p>
+            <w:r>
+              <w:t>GitHub login credential (which account pushes go to):</w:t>
+            </w:r>
+          </w:p>
+          <w:p>
+            <w:r>
+              <w:t xml:space="preserve">    Saved in Windows Credential Manager on your computer.</w:t>
+            </w:r>
+          </w:p>
+          <w:p>
+            <w:r>
+              <w:t xml:space="preserve">    If the wrong account is saved, pushes will use that account</w:t>
+            </w:r>
+          </w:p>
+          <w:p>
+            <w:r>
+              <w:t xml:space="preserve">    regardless of what user.name says.</w:t>
+            </w:r>
+          </w:p>
+          <w:p>
+            <w:r>
+              <w:t/>
+            </w:r>
+          </w:p>
+          <w:p>
+            <w:r>
+              <w:t>Fix: Remove the old credential from Windows Credential Manager,</w:t>
+            </w:r>
+          </w:p>
+          <w:p>
+            <w:r>
+              <w:t>then push again to be prompted for the correct GitHub account.</w:t>
+            </w:r>
+          </w:p>
+        </w:tc>
+      </w:tr>
+    </w:tbl>
+    <w:p/>
+    <w:p>
+      <w:r>
+        <w:rPr>
+          <w:b/>
+        </w:rPr>
+        <w:t>Activity 18: Practice Pull Before Push</w:t>
+      </w:r>
+    </w:p>
+    <w:p>
+      <w:r>
+        <w:rPr/>
+        <w:t>Purpose: To practice the recommended regular workflow — always pull first, then edit, commit, and push.</w:t>
+      </w:r>
+    </w:p>
+    <w:p/>
+    <w:p>
+      <w:r>
+        <w:rPr/>
+        <w:t>Step 1. Open the VS Code Terminal inside the cpp102-week1-lastname project folder.</w:t>
+      </w:r>
+    </w:p>
+    <w:p/>
+    <w:p>
+      <w:r>
+        <w:rPr/>
+        <w:t>Step 2. Before editing any file, run:</w:t>
+      </w:r>
+    </w:p>
+    <w:tbl>
+      <w:tblPr>
+        <w:tblW w:w="8920" w:type="dxa"/>
+        <w:tblBorders>
+          <w:top w:val="single" w:sz="4" w:color="2E7D32"/>
+          <w:left w:val="single" w:sz="4" w:color="2E7D32"/>
+          <w:bottom w:val="single" w:sz="4" w:color="2E7D32"/>
+          <w:right w:val="single" w:sz="4" w:color="2E7D32"/>
+          <w:insideH w:val="single" w:sz="4" w:color="2E7D32"/>
+          <w:insideV w:val="single" w:sz="4" w:color="2E7D32"/>
+        </w:tblBorders>
+        <w:shd w:val="clear" w:fill="F2F2F2"/>
+      </w:tblPr>
+      <w:tblGrid>
+        <w:gridCol w:w="8920"/>
+      </w:tblGrid>
+      <w:tr>
+        <w:tc>
+          <w:tcPr>
+            <w:tcW w:w="8920" w:type="dxa"/>
+            <w:shd w:val="clear" w:fill="F2F2F2"/>
+          </w:tcPr>
+          <w:p>
+            <w:r>
+              <w:rPr>
+                <w:rFonts w:ascii="Courier New" w:hAnsi="Courier New"/>
+                <w:sz w:val="18"/>
+              </w:rPr>
+              <w:t>git pull</w:t>
+            </w:r>
+          </w:p>
+        </w:tc>
+      </w:tr>
+    </w:tbl>
+    <w:p>
+      <w:r>
+        <w:rPr/>
+        <w:t>Expected result: "Already up to date." (or it downloads the latest changes from GitHub.)</w:t>
+      </w:r>
+    </w:p>
+    <w:p/>
+    <w:p>
+      <w:r>
+        <w:rPr/>
+        <w:t>Step 3. Open README.md and add one sentence to your Reflection. Example:</w:t>
+      </w:r>
+    </w:p>
+    <w:tbl>
+      <w:tblPr>
+        <w:tblW w:w="8920" w:type="dxa"/>
+        <w:tblBorders>
+          <w:top w:val="single" w:sz="4" w:color="2E7D32"/>
+          <w:left w:val="single" w:sz="4" w:color="2E7D32"/>
+          <w:bottom w:val="single" w:sz="4" w:color="2E7D32"/>
+          <w:right w:val="single" w:sz="4" w:color="2E7D32"/>
+          <w:insideH w:val="single" w:sz="4" w:color="2E7D32"/>
+          <w:insideV w:val="single" w:sz="4" w:color="2E7D32"/>
+        </w:tblBorders>
+        <w:shd w:val="clear" w:fill="F2F2F2"/>
+      </w:tblPr>
+      <w:tblGrid>
+        <w:gridCol w:w="8920"/>
+      </w:tblGrid>
+      <w:tr>
+        <w:tc>
+          <w:tcPr>
+            <w:tcW w:w="8920" w:type="dxa"/>
+            <w:shd w:val="clear" w:fill="F2F2F2"/>
+          </w:tcPr>
+          <w:p>
+            <w:r>
+              <w:rPr>
+                <w:rFonts w:ascii="Courier New" w:hAnsi="Courier New"/>
+                <w:sz w:val="18"/>
+              </w:rPr>
+              <w:t>I now understand that git pull keeps my local folder in sync with GitHub before I start editing.</w:t>
+            </w:r>
+          </w:p>
+        </w:tc>
+      </w:tr>
+    </w:tbl>
+    <w:p>
+      <w:r>
+        <w:rPr/>
+        <w:t>Save the file (Ctrl+S).</w:t>
+      </w:r>
+    </w:p>
+    <w:p/>
+    <w:p>
+      <w:r>
+        <w:rPr/>
+        <w:t>Step 4. Run the full commit-and-push workflow:</w:t>
+      </w:r>
+    </w:p>
+    <w:tbl>
+      <w:tblPr>
+        <w:tblW w:w="8920" w:type="dxa"/>
+        <w:tblBorders>
+          <w:top w:val="single" w:sz="4" w:color="2E7D32"/>
+          <w:left w:val="single" w:sz="4" w:color="2E7D32"/>
+          <w:bottom w:val="single" w:sz="4" w:color="2E7D32"/>
+          <w:right w:val="single" w:sz="4" w:color="2E7D32"/>
+          <w:insideH w:val="single" w:sz="4" w:color="2E7D32"/>
+          <w:insideV w:val="single" w:sz="4" w:color="2E7D32"/>
+        </w:tblBorders>
+        <w:shd w:val="clear" w:fill="F2F2F2"/>
+      </w:tblPr>
+      <w:tblGrid>
+        <w:gridCol w:w="8920"/>
+      </w:tblGrid>
+      <w:tr>
+        <w:tc>
+          <w:tcPr>
+            <w:tcW w:w="8920" w:type="dxa"/>
+            <w:shd w:val="clear" w:fill="F2F2F2"/>
+          </w:tcPr>
+          <w:p>
+            <w:r>
+              <w:rPr>
+                <w:rFonts w:ascii="Courier New" w:hAnsi="Courier New"/>
+                <w:sz w:val="18"/>
+              </w:rPr>
+              <w:t>git status</w:t>
+            </w:r>
+          </w:p>
+          <w:p>
+            <w:r>
+              <w:rPr>
+                <w:rFonts w:ascii="Courier New" w:hAnsi="Courier New"/>
+                <w:sz w:val="18"/>
+              </w:rPr>
+              <w:t>git add .</w:t>
+            </w:r>
+          </w:p>
+          <w:p>
+            <w:r>
+              <w:rPr>
+                <w:rFonts w:ascii="Courier New" w:hAnsi="Courier New"/>
+                <w:sz w:val="18"/>
+              </w:rPr>
+              <w:t>git commit -m "update README reflection"</w:t>
+            </w:r>
+          </w:p>
+          <w:p>
+            <w:r>
+              <w:rPr>
+                <w:rFonts w:ascii="Courier New" w:hAnsi="Courier New"/>
+                <w:sz w:val="18"/>
+              </w:rPr>
+              <w:t>git push</w:t>
+            </w:r>
+          </w:p>
+        </w:tc>
+      </w:tr>
+    </w:tbl>
+    <w:p/>
+    <w:p>
+      <w:r>
+        <w:rPr/>
+        <w:t>Step 5. Open the GitHub repository in your browser and confirm that README.md shows the updated reflection.</w:t>
+      </w:r>
+    </w:p>
+    <w:p>
+      <w:r>
+        <w:rPr/>
+        <w:t>Step 6. Take a screenshot of the updated README.md on GitHub as evidence of successful push.</w:t>
+      </w:r>
+    </w:p>
     <w:p>
       <w:pPr>
         <w:pStyle w:val="Heading2"/>
@@ -13574,6 +14494,361 @@
           </w:p>
         </w:tc>
       </w:tr>
+      <w:tr>
+        <w:tc>
+          <w:tcPr>
+            <w:tcW w:type="dxa" w:w="600"/>
+            <w:tcBorders>
+              <w:top w:val="single" w:color="BFBFBF" w:sz="4"/>
+              <w:left w:val="single" w:color="BFBFBF" w:sz="4"/>
+              <w:bottom w:val="single" w:color="BFBFBF" w:sz="4"/>
+              <w:right w:val="single" w:color="BFBFBF" w:sz="4"/>
+            </w:tcBorders>
+            <w:tcMar>
+              <w:top w:type="dxa" w:w="80"/>
+              <w:left w:type="dxa" w:w="120"/>
+              <w:bottom w:type="dxa" w:w="80"/>
+              <w:right w:type="dxa" w:w="120"/>
+            </w:tcMar>
+            <w:vAlign w:val="center"/>
+          </w:tcPr>
+          <w:p>
+            <w:r>
+              <w:t>16</w:t>
+            </w:r>
+          </w:p>
+        </w:tc>
+        <w:tc>
+          <w:tcPr>
+            <w:tcW w:type="dxa" w:w="1800"/>
+            <w:tcBorders>
+              <w:top w:val="single" w:color="BFBFBF" w:sz="4"/>
+              <w:left w:val="single" w:color="BFBFBF" w:sz="4"/>
+              <w:bottom w:val="single" w:color="BFBFBF" w:sz="4"/>
+              <w:right w:val="single" w:color="BFBFBF" w:sz="4"/>
+            </w:tcBorders>
+            <w:tcMar>
+              <w:top w:type="dxa" w:w="80"/>
+              <w:left w:type="dxa" w:w="120"/>
+              <w:bottom w:type="dxa" w:w="80"/>
+              <w:right w:type="dxa" w:w="120"/>
+            </w:tcMar>
+            <w:vAlign w:val="center"/>
+          </w:tcPr>
+          <w:p>
+            <w:r>
+              <w:t>Identification</w:t>
+            </w:r>
+          </w:p>
+        </w:tc>
+        <w:tc>
+          <w:tcPr>
+            <w:tcW w:type="dxa" w:w="6960"/>
+            <w:tcBorders>
+              <w:top w:val="single" w:color="BFBFBF" w:sz="4"/>
+              <w:left w:val="single" w:color="BFBFBF" w:sz="4"/>
+              <w:bottom w:val="single" w:color="BFBFBF" w:sz="4"/>
+              <w:right w:val="single" w:color="BFBFBF" w:sz="4"/>
+            </w:tcBorders>
+            <w:tcMar>
+              <w:top w:type="dxa" w:w="80"/>
+              <w:left w:type="dxa" w:w="120"/>
+              <w:bottom w:type="dxa" w:w="80"/>
+              <w:right w:type="dxa" w:w="120"/>
+            </w:tcMar>
+            <w:vAlign w:val="center"/>
+          </w:tcPr>
+          <w:p>
+            <w:r>
+              <w:t>What Git command downloads the latest changes from GitHub to the local project folder?</w:t>
+            </w:r>
+          </w:p>
+        </w:tc>
+      </w:tr>
+      <w:tr>
+        <w:tc>
+          <w:tcPr>
+            <w:tcW w:type="dxa" w:w="600"/>
+            <w:tcBorders>
+              <w:top w:val="single" w:color="BFBFBF" w:sz="4"/>
+              <w:left w:val="single" w:color="BFBFBF" w:sz="4"/>
+              <w:bottom w:val="single" w:color="BFBFBF" w:sz="4"/>
+              <w:right w:val="single" w:color="BFBFBF" w:sz="4"/>
+            </w:tcBorders>
+            <w:tcMar>
+              <w:top w:type="dxa" w:w="80"/>
+              <w:left w:type="dxa" w:w="120"/>
+              <w:bottom w:type="dxa" w:w="80"/>
+              <w:right w:type="dxa" w:w="120"/>
+            </w:tcMar>
+            <w:vAlign w:val="center"/>
+          </w:tcPr>
+          <w:p>
+            <w:r>
+              <w:t>17</w:t>
+            </w:r>
+          </w:p>
+        </w:tc>
+        <w:tc>
+          <w:tcPr>
+            <w:tcW w:type="dxa" w:w="1800"/>
+            <w:tcBorders>
+              <w:top w:val="single" w:color="BFBFBF" w:sz="4"/>
+              <w:left w:val="single" w:color="BFBFBF" w:sz="4"/>
+              <w:bottom w:val="single" w:color="BFBFBF" w:sz="4"/>
+              <w:right w:val="single" w:color="BFBFBF" w:sz="4"/>
+            </w:tcBorders>
+            <w:tcMar>
+              <w:top w:type="dxa" w:w="80"/>
+              <w:left w:type="dxa" w:w="120"/>
+              <w:bottom w:type="dxa" w:w="80"/>
+              <w:right w:type="dxa" w:w="120"/>
+            </w:tcMar>
+            <w:vAlign w:val="center"/>
+          </w:tcPr>
+          <w:p>
+            <w:r>
+              <w:t>Short Answer</w:t>
+            </w:r>
+          </w:p>
+        </w:tc>
+        <w:tc>
+          <w:tcPr>
+            <w:tcW w:type="dxa" w:w="6960"/>
+            <w:tcBorders>
+              <w:top w:val="single" w:color="BFBFBF" w:sz="4"/>
+              <w:left w:val="single" w:color="BFBFBF" w:sz="4"/>
+              <w:bottom w:val="single" w:color="BFBFBF" w:sz="4"/>
+              <w:right w:val="single" w:color="BFBFBF" w:sz="4"/>
+            </w:tcBorders>
+            <w:tcMar>
+              <w:top w:type="dxa" w:w="80"/>
+              <w:left w:type="dxa" w:w="120"/>
+              <w:bottom w:type="dxa" w:w="80"/>
+              <w:right w:type="dxa" w:w="120"/>
+            </w:tcMar>
+            <w:vAlign w:val="center"/>
+          </w:tcPr>
+          <w:p>
+            <w:r>
+              <w:t>When should a student run git pull?</w:t>
+            </w:r>
+          </w:p>
+        </w:tc>
+      </w:tr>
+      <w:tr>
+        <w:tc>
+          <w:tcPr>
+            <w:tcW w:type="dxa" w:w="600"/>
+            <w:tcBorders>
+              <w:top w:val="single" w:color="BFBFBF" w:sz="4"/>
+              <w:left w:val="single" w:color="BFBFBF" w:sz="4"/>
+              <w:bottom w:val="single" w:color="BFBFBF" w:sz="4"/>
+              <w:right w:val="single" w:color="BFBFBF" w:sz="4"/>
+            </w:tcBorders>
+            <w:tcMar>
+              <w:top w:type="dxa" w:w="80"/>
+              <w:left w:type="dxa" w:w="120"/>
+              <w:bottom w:type="dxa" w:w="80"/>
+              <w:right w:type="dxa" w:w="120"/>
+            </w:tcMar>
+            <w:vAlign w:val="center"/>
+          </w:tcPr>
+          <w:p>
+            <w:r>
+              <w:t>18</w:t>
+            </w:r>
+          </w:p>
+        </w:tc>
+        <w:tc>
+          <w:tcPr>
+            <w:tcW w:type="dxa" w:w="1800"/>
+            <w:tcBorders>
+              <w:top w:val="single" w:color="BFBFBF" w:sz="4"/>
+              <w:left w:val="single" w:color="BFBFBF" w:sz="4"/>
+              <w:bottom w:val="single" w:color="BFBFBF" w:sz="4"/>
+              <w:right w:val="single" w:color="BFBFBF" w:sz="4"/>
+            </w:tcBorders>
+            <w:tcMar>
+              <w:top w:type="dxa" w:w="80"/>
+              <w:left w:type="dxa" w:w="120"/>
+              <w:bottom w:type="dxa" w:w="80"/>
+              <w:right w:type="dxa" w:w="120"/>
+            </w:tcMar>
+            <w:vAlign w:val="center"/>
+          </w:tcPr>
+          <w:p>
+            <w:r>
+              <w:t>Short Answer</w:t>
+            </w:r>
+          </w:p>
+        </w:tc>
+        <w:tc>
+          <w:tcPr>
+            <w:tcW w:type="dxa" w:w="6960"/>
+            <w:tcBorders>
+              <w:top w:val="single" w:color="BFBFBF" w:sz="4"/>
+              <w:left w:val="single" w:color="BFBFBF" w:sz="4"/>
+              <w:bottom w:val="single" w:color="BFBFBF" w:sz="4"/>
+              <w:right w:val="single" w:color="BFBFBF" w:sz="4"/>
+            </w:tcBorders>
+            <w:tcMar>
+              <w:top w:type="dxa" w:w="80"/>
+              <w:left w:type="dxa" w:w="120"/>
+              <w:bottom w:type="dxa" w:w="80"/>
+              <w:right w:type="dxa" w:w="120"/>
+            </w:tcMar>
+            <w:vAlign w:val="center"/>
+          </w:tcPr>
+          <w:p>
+            <w:r>
+              <w:t>What usually causes the error "failed to push some refs"?</w:t>
+            </w:r>
+          </w:p>
+        </w:tc>
+      </w:tr>
+      <w:tr>
+        <w:tc>
+          <w:tcPr>
+            <w:tcW w:type="dxa" w:w="600"/>
+            <w:tcBorders>
+              <w:top w:val="single" w:color="BFBFBF" w:sz="4"/>
+              <w:left w:val="single" w:color="BFBFBF" w:sz="4"/>
+              <w:bottom w:val="single" w:color="BFBFBF" w:sz="4"/>
+              <w:right w:val="single" w:color="BFBFBF" w:sz="4"/>
+            </w:tcBorders>
+            <w:tcMar>
+              <w:top w:type="dxa" w:w="80"/>
+              <w:left w:type="dxa" w:w="120"/>
+              <w:bottom w:type="dxa" w:w="80"/>
+              <w:right w:type="dxa" w:w="120"/>
+            </w:tcMar>
+            <w:vAlign w:val="center"/>
+          </w:tcPr>
+          <w:p>
+            <w:r>
+              <w:t>19</w:t>
+            </w:r>
+          </w:p>
+        </w:tc>
+        <w:tc>
+          <w:tcPr>
+            <w:tcW w:type="dxa" w:w="1800"/>
+            <w:tcBorders>
+              <w:top w:val="single" w:color="BFBFBF" w:sz="4"/>
+              <w:left w:val="single" w:color="BFBFBF" w:sz="4"/>
+              <w:bottom w:val="single" w:color="BFBFBF" w:sz="4"/>
+              <w:right w:val="single" w:color="BFBFBF" w:sz="4"/>
+            </w:tcBorders>
+            <w:tcMar>
+              <w:top w:type="dxa" w:w="80"/>
+              <w:left w:type="dxa" w:w="120"/>
+              <w:bottom w:type="dxa" w:w="80"/>
+              <w:right w:type="dxa" w:w="120"/>
+            </w:tcMar>
+            <w:vAlign w:val="center"/>
+          </w:tcPr>
+          <w:p>
+            <w:r>
+              <w:t>Short Answer</w:t>
+            </w:r>
+          </w:p>
+        </w:tc>
+        <w:tc>
+          <w:tcPr>
+            <w:tcW w:type="dxa" w:w="6960"/>
+            <w:tcBorders>
+              <w:top w:val="single" w:color="BFBFBF" w:sz="4"/>
+              <w:left w:val="single" w:color="BFBFBF" w:sz="4"/>
+              <w:bottom w:val="single" w:color="BFBFBF" w:sz="4"/>
+              <w:right w:val="single" w:color="BFBFBF" w:sz="4"/>
+            </w:tcBorders>
+            <w:tcMar>
+              <w:top w:type="dxa" w:w="80"/>
+              <w:left w:type="dxa" w:w="120"/>
+              <w:bottom w:type="dxa" w:w="80"/>
+              <w:right w:type="dxa" w:w="120"/>
+            </w:tcMar>
+            <w:vAlign w:val="center"/>
+          </w:tcPr>
+          <w:p>
+            <w:r>
+              <w:t>Why should students avoid editing files directly on GitHub when they are also working in VS Code?</w:t>
+            </w:r>
+          </w:p>
+        </w:tc>
+      </w:tr>
+      <w:tr>
+        <w:tc>
+          <w:tcPr>
+            <w:tcW w:type="dxa" w:w="600"/>
+            <w:tcBorders>
+              <w:top w:val="single" w:color="BFBFBF" w:sz="4"/>
+              <w:left w:val="single" w:color="BFBFBF" w:sz="4"/>
+              <w:bottom w:val="single" w:color="BFBFBF" w:sz="4"/>
+              <w:right w:val="single" w:color="BFBFBF" w:sz="4"/>
+            </w:tcBorders>
+            <w:tcMar>
+              <w:top w:type="dxa" w:w="80"/>
+              <w:left w:type="dxa" w:w="120"/>
+              <w:bottom w:type="dxa" w:w="80"/>
+              <w:right w:type="dxa" w:w="120"/>
+            </w:tcMar>
+            <w:vAlign w:val="center"/>
+          </w:tcPr>
+          <w:p>
+            <w:r>
+              <w:t>20</w:t>
+            </w:r>
+          </w:p>
+        </w:tc>
+        <w:tc>
+          <w:tcPr>
+            <w:tcW w:type="dxa" w:w="1800"/>
+            <w:tcBorders>
+              <w:top w:val="single" w:color="BFBFBF" w:sz="4"/>
+              <w:left w:val="single" w:color="BFBFBF" w:sz="4"/>
+              <w:bottom w:val="single" w:color="BFBFBF" w:sz="4"/>
+              <w:right w:val="single" w:color="BFBFBF" w:sz="4"/>
+            </w:tcBorders>
+            <w:tcMar>
+              <w:top w:type="dxa" w:w="80"/>
+              <w:left w:type="dxa" w:w="120"/>
+              <w:bottom w:type="dxa" w:w="80"/>
+              <w:right w:type="dxa" w:w="120"/>
+            </w:tcMar>
+            <w:vAlign w:val="center"/>
+          </w:tcPr>
+          <w:p>
+            <w:r>
+              <w:t>Short Answer</w:t>
+            </w:r>
+          </w:p>
+        </w:tc>
+        <w:tc>
+          <w:tcPr>
+            <w:tcW w:type="dxa" w:w="6960"/>
+            <w:tcBorders>
+              <w:top w:val="single" w:color="BFBFBF" w:sz="4"/>
+              <w:left w:val="single" w:color="BFBFBF" w:sz="4"/>
+              <w:bottom w:val="single" w:color="BFBFBF" w:sz="4"/>
+              <w:right w:val="single" w:color="BFBFBF" w:sz="4"/>
+            </w:tcBorders>
+            <w:tcMar>
+              <w:top w:type="dxa" w:w="80"/>
+              <w:left w:type="dxa" w:w="120"/>
+              <w:bottom w:type="dxa" w:w="80"/>
+              <w:right w:type="dxa" w:w="120"/>
+            </w:tcMar>
+            <w:vAlign w:val="center"/>
+          </w:tcPr>
+          <w:p>
+            <w:r>
+              <w:t>What is the difference between Git commit identity (user.name / user.email) and GitHub login credential?</w:t>
+            </w:r>
+          </w:p>
+        </w:tc>
+      </w:tr>
     </w:tbl>
     <w:p>
       <w:pPr>
@@ -16570,6 +17845,246 @@
           </w:p>
         </w:tc>
       </w:tr>
+      <w:tr>
+        <w:tc>
+          <w:tcPr>
+            <w:tcW w:type="dxa" w:w="600"/>
+            <w:tcBorders>
+              <w:top w:val="single" w:color="BFBFBF" w:sz="4"/>
+              <w:left w:val="single" w:color="BFBFBF" w:sz="4"/>
+              <w:bottom w:val="single" w:color="BFBFBF" w:sz="4"/>
+              <w:right w:val="single" w:color="BFBFBF" w:sz="4"/>
+            </w:tcBorders>
+            <w:tcMar>
+              <w:top w:type="dxa" w:w="80"/>
+              <w:left w:type="dxa" w:w="120"/>
+              <w:bottom w:type="dxa" w:w="80"/>
+              <w:right w:type="dxa" w:w="120"/>
+            </w:tcMar>
+            <w:vAlign w:val="center"/>
+          </w:tcPr>
+          <w:p>
+            <w:r>
+              <w:t>16</w:t>
+            </w:r>
+          </w:p>
+        </w:tc>
+        <w:tc>
+          <w:tcPr>
+            <w:tcW w:type="dxa" w:w="8760"/>
+            <w:tcBorders>
+              <w:top w:val="single" w:color="BFBFBF" w:sz="4"/>
+              <w:left w:val="single" w:color="BFBFBF" w:sz="4"/>
+              <w:bottom w:val="single" w:color="BFBFBF" w:sz="4"/>
+              <w:right w:val="single" w:color="BFBFBF" w:sz="4"/>
+            </w:tcBorders>
+            <w:tcMar>
+              <w:top w:type="dxa" w:w="80"/>
+              <w:left w:type="dxa" w:w="120"/>
+              <w:bottom w:type="dxa" w:w="80"/>
+              <w:right w:type="dxa" w:w="120"/>
+            </w:tcMar>
+            <w:vAlign w:val="center"/>
+          </w:tcPr>
+          <w:p>
+            <w:r>
+              <w:t>git pull</w:t>
+            </w:r>
+          </w:p>
+        </w:tc>
+      </w:tr>
+      <w:tr>
+        <w:tc>
+          <w:tcPr>
+            <w:tcW w:type="dxa" w:w="600"/>
+            <w:tcBorders>
+              <w:top w:val="single" w:color="BFBFBF" w:sz="4"/>
+              <w:left w:val="single" w:color="BFBFBF" w:sz="4"/>
+              <w:bottom w:val="single" w:color="BFBFBF" w:sz="4"/>
+              <w:right w:val="single" w:color="BFBFBF" w:sz="4"/>
+            </w:tcBorders>
+            <w:tcMar>
+              <w:top w:type="dxa" w:w="80"/>
+              <w:left w:type="dxa" w:w="120"/>
+              <w:bottom w:type="dxa" w:w="80"/>
+              <w:right w:type="dxa" w:w="120"/>
+            </w:tcMar>
+            <w:vAlign w:val="center"/>
+          </w:tcPr>
+          <w:p>
+            <w:r>
+              <w:t>17</w:t>
+            </w:r>
+          </w:p>
+        </w:tc>
+        <w:tc>
+          <w:tcPr>
+            <w:tcW w:type="dxa" w:w="8760"/>
+            <w:tcBorders>
+              <w:top w:val="single" w:color="BFBFBF" w:sz="4"/>
+              <w:left w:val="single" w:color="BFBFBF" w:sz="4"/>
+              <w:bottom w:val="single" w:color="BFBFBF" w:sz="4"/>
+              <w:right w:val="single" w:color="BFBFBF" w:sz="4"/>
+            </w:tcBorders>
+            <w:tcMar>
+              <w:top w:type="dxa" w:w="80"/>
+              <w:left w:type="dxa" w:w="120"/>
+              <w:bottom w:type="dxa" w:w="80"/>
+              <w:right w:type="dxa" w:w="120"/>
+            </w:tcMar>
+            <w:vAlign w:val="center"/>
+          </w:tcPr>
+          <w:p>
+            <w:r>
+              <w:t>Before starting any editing session — especially after files may have been changed on GitHub, from another computer, or by another group member.</w:t>
+            </w:r>
+          </w:p>
+        </w:tc>
+      </w:tr>
+      <w:tr>
+        <w:tc>
+          <w:tcPr>
+            <w:tcW w:type="dxa" w:w="600"/>
+            <w:tcBorders>
+              <w:top w:val="single" w:color="BFBFBF" w:sz="4"/>
+              <w:left w:val="single" w:color="BFBFBF" w:sz="4"/>
+              <w:bottom w:val="single" w:color="BFBFBF" w:sz="4"/>
+              <w:right w:val="single" w:color="BFBFBF" w:sz="4"/>
+            </w:tcBorders>
+            <w:tcMar>
+              <w:top w:type="dxa" w:w="80"/>
+              <w:left w:type="dxa" w:w="120"/>
+              <w:bottom w:type="dxa" w:w="80"/>
+              <w:right w:type="dxa" w:w="120"/>
+            </w:tcMar>
+            <w:vAlign w:val="center"/>
+          </w:tcPr>
+          <w:p>
+            <w:r>
+              <w:t>18</w:t>
+            </w:r>
+          </w:p>
+        </w:tc>
+        <w:tc>
+          <w:tcPr>
+            <w:tcW w:type="dxa" w:w="8760"/>
+            <w:tcBorders>
+              <w:top w:val="single" w:color="BFBFBF" w:sz="4"/>
+              <w:left w:val="single" w:color="BFBFBF" w:sz="4"/>
+              <w:bottom w:val="single" w:color="BFBFBF" w:sz="4"/>
+              <w:right w:val="single" w:color="BFBFBF" w:sz="4"/>
+            </w:tcBorders>
+            <w:tcMar>
+              <w:top w:type="dxa" w:w="80"/>
+              <w:left w:type="dxa" w:w="120"/>
+              <w:bottom w:type="dxa" w:w="80"/>
+              <w:right w:type="dxa" w:w="120"/>
+            </w:tcMar>
+            <w:vAlign w:val="center"/>
+          </w:tcPr>
+          <w:p>
+            <w:r>
+              <w:t>The GitHub repository has changes not yet in the local folder. This often happens when a file was edited directly on GitHub or another student pushed first.</w:t>
+            </w:r>
+          </w:p>
+        </w:tc>
+      </w:tr>
+      <w:tr>
+        <w:tc>
+          <w:tcPr>
+            <w:tcW w:type="dxa" w:w="600"/>
+            <w:tcBorders>
+              <w:top w:val="single" w:color="BFBFBF" w:sz="4"/>
+              <w:left w:val="single" w:color="BFBFBF" w:sz="4"/>
+              <w:bottom w:val="single" w:color="BFBFBF" w:sz="4"/>
+              <w:right w:val="single" w:color="BFBFBF" w:sz="4"/>
+            </w:tcBorders>
+            <w:tcMar>
+              <w:top w:type="dxa" w:w="80"/>
+              <w:left w:type="dxa" w:w="120"/>
+              <w:bottom w:type="dxa" w:w="80"/>
+              <w:right w:type="dxa" w:w="120"/>
+            </w:tcMar>
+            <w:vAlign w:val="center"/>
+          </w:tcPr>
+          <w:p>
+            <w:r>
+              <w:t>19</w:t>
+            </w:r>
+          </w:p>
+        </w:tc>
+        <w:tc>
+          <w:tcPr>
+            <w:tcW w:type="dxa" w:w="8760"/>
+            <w:tcBorders>
+              <w:top w:val="single" w:color="BFBFBF" w:sz="4"/>
+              <w:left w:val="single" w:color="BFBFBF" w:sz="4"/>
+              <w:bottom w:val="single" w:color="BFBFBF" w:sz="4"/>
+              <w:right w:val="single" w:color="BFBFBF" w:sz="4"/>
+            </w:tcBorders>
+            <w:tcMar>
+              <w:top w:type="dxa" w:w="80"/>
+              <w:left w:type="dxa" w:w="120"/>
+              <w:bottom w:type="dxa" w:w="80"/>
+              <w:right w:type="dxa" w:w="120"/>
+            </w:tcMar>
+            <w:vAlign w:val="center"/>
+          </w:tcPr>
+          <w:p>
+            <w:r>
+              <w:t>Editing on GitHub creates a newer remote version. When a student then pushes from VS Code, Git rejects the push because the local folder is behind. Running git pull first synchronizes both.</w:t>
+            </w:r>
+          </w:p>
+        </w:tc>
+      </w:tr>
+      <w:tr>
+        <w:tc>
+          <w:tcPr>
+            <w:tcW w:type="dxa" w:w="600"/>
+            <w:tcBorders>
+              <w:top w:val="single" w:color="BFBFBF" w:sz="4"/>
+              <w:left w:val="single" w:color="BFBFBF" w:sz="4"/>
+              <w:bottom w:val="single" w:color="BFBFBF" w:sz="4"/>
+              <w:right w:val="single" w:color="BFBFBF" w:sz="4"/>
+            </w:tcBorders>
+            <w:tcMar>
+              <w:top w:type="dxa" w:w="80"/>
+              <w:left w:type="dxa" w:w="120"/>
+              <w:bottom w:type="dxa" w:w="80"/>
+              <w:right w:type="dxa" w:w="120"/>
+            </w:tcMar>
+            <w:vAlign w:val="center"/>
+          </w:tcPr>
+          <w:p>
+            <w:r>
+              <w:t>20</w:t>
+            </w:r>
+          </w:p>
+        </w:tc>
+        <w:tc>
+          <w:tcPr>
+            <w:tcW w:type="dxa" w:w="8760"/>
+            <w:tcBorders>
+              <w:top w:val="single" w:color="BFBFBF" w:sz="4"/>
+              <w:left w:val="single" w:color="BFBFBF" w:sz="4"/>
+              <w:bottom w:val="single" w:color="BFBFBF" w:sz="4"/>
+              <w:right w:val="single" w:color="BFBFBF" w:sz="4"/>
+            </w:tcBorders>
+            <w:tcMar>
+              <w:top w:type="dxa" w:w="80"/>
+              <w:left w:type="dxa" w:w="120"/>
+              <w:bottom w:type="dxa" w:w="80"/>
+              <w:right w:type="dxa" w:w="120"/>
+            </w:tcMar>
+            <w:vAlign w:val="center"/>
+          </w:tcPr>
+          <w:p>
+            <w:r>
+              <w:t>Git commit identity (user.name / user.email) sets the author name and email shown in commits. GitHub login credential, stored in Windows Credential Manager, controls which GitHub account authenticates the push. Changing user.name does not change which account is used for pushing.</w:t>
+            </w:r>
+          </w:p>
+        </w:tc>
+      </w:tr>
     </w:tbl>
     <w:p>
       <w:pPr>
@@ -17115,21 +18630,26 @@
 <w:ftr xmlns:wpc="http://schemas.microsoft.com/office/word/2010/wordprocessingCanvas" xmlns:mc="http://schemas.openxmlformats.org/markup-compatibility/2006" xmlns:o="urn:schemas-microsoft-com:office:office" xmlns:r="http://schemas.openxmlformats.org/officeDocument/2006/relationships" xmlns:m="http://schemas.openxmlformats.org/officeDocument/2006/math" xmlns:v="urn:schemas-microsoft-com:vml" xmlns:wp14="http://schemas.microsoft.com/office/word/2010/wordprocessingDrawing" xmlns:wp="http://schemas.openxmlformats.org/drawingml/2006/wordprocessingDrawing" xmlns:w10="urn:schemas-microsoft-com:office:word" xmlns:w="http://schemas.openxmlformats.org/wordprocessingml/2006/main" xmlns:w14="http://schemas.microsoft.com/office/word/2010/wordml" xmlns:w15="http://schemas.microsoft.com/office/word/2012/wordml" xmlns:wpg="http://schemas.microsoft.com/office/word/2010/wordprocessingGroup" xmlns:wpi="http://schemas.microsoft.com/office/word/2010/wordprocessingInk" xmlns:wne="http://schemas.microsoft.com/office/word/2006/wordml" xmlns:wps="http://schemas.microsoft.com/office/word/2010/wordprocessingShape">
   <w:p>
     <w:pPr>
+      <w:pBdr>
+        <w:top w:val="single" w:color="388E3C" w:sz="6" w:space="1"/>
+      </w:pBdr>
       <w:jc w:val="center"/>
     </w:pPr>
     <w:r>
       <w:rPr>
-        <w:color w:val="808080"/>
-        <w:sz w:val="16"/>
-        <w:szCs w:val="16"/>
+        <w:rFonts w:ascii="Arial" w:cs="Arial" w:eastAsia="Arial" w:hAnsi="Arial"/>
+        <w:color w:val="555555"/>
+        <w:sz w:val="20"/>
+        <w:szCs w:val="20"/>
       </w:rPr>
-      <w:t xml:space="preserve">Page </w:t>
+      <w:t xml:space="preserve">Department of Computer Engineering  |  Page </w:t>
     </w:r>
     <w:r>
       <w:rPr>
-        <w:color w:val="808080"/>
-        <w:sz w:val="16"/>
-        <w:szCs w:val="16"/>
+        <w:rFonts w:ascii="Arial" w:cs="Arial" w:eastAsia="Arial" w:hAnsi="Arial"/>
+        <w:color w:val="555555"/>
+        <w:sz w:val="20"/>
+        <w:szCs w:val="20"/>
       </w:rPr>
       <w:fldChar w:fldCharType="begin"/>
       <w:instrText xml:space="preserve">PAGE</w:instrText>
@@ -17181,15 +18701,18 @@
 <w:hdr xmlns:wpc="http://schemas.microsoft.com/office/word/2010/wordprocessingCanvas" xmlns:mc="http://schemas.openxmlformats.org/markup-compatibility/2006" xmlns:o="urn:schemas-microsoft-com:office:office" xmlns:r="http://schemas.openxmlformats.org/officeDocument/2006/relationships" xmlns:m="http://schemas.openxmlformats.org/officeDocument/2006/math" xmlns:v="urn:schemas-microsoft-com:vml" xmlns:wp14="http://schemas.microsoft.com/office/word/2010/wordprocessingDrawing" xmlns:wp="http://schemas.openxmlformats.org/drawingml/2006/wordprocessingDrawing" xmlns:w10="urn:schemas-microsoft-com:office:word" xmlns:w="http://schemas.openxmlformats.org/wordprocessingml/2006/main" xmlns:w14="http://schemas.microsoft.com/office/word/2010/wordml" xmlns:w15="http://schemas.microsoft.com/office/word/2012/wordml" xmlns:wpg="http://schemas.microsoft.com/office/word/2010/wordprocessingGroup" xmlns:wpi="http://schemas.microsoft.com/office/word/2010/wordprocessingInk" xmlns:wne="http://schemas.microsoft.com/office/word/2006/wordml" xmlns:wps="http://schemas.microsoft.com/office/word/2010/wordprocessingShape" xmlns:cx="http://schemas.microsoft.com/office/drawing/2014/chartex" xmlns:cx1="http://schemas.microsoft.com/office/drawing/2015/9/8/chartex" xmlns:cx2="http://schemas.microsoft.com/office/drawing/2015/10/21/chartex" xmlns:cx3="http://schemas.microsoft.com/office/drawing/2016/5/9/chartex" xmlns:cx4="http://schemas.microsoft.com/office/drawing/2016/5/10/chartex" xmlns:cx5="http://schemas.microsoft.com/office/drawing/2016/5/11/chartex" xmlns:cx6="http://schemas.microsoft.com/office/drawing/2016/5/12/chartex" xmlns:cx7="http://schemas.microsoft.com/office/drawing/2016/5/13/chartex" xmlns:cx8="http://schemas.microsoft.com/office/drawing/2016/5/14/chartex" xmlns:w16cid="http://schemas.microsoft.com/office/word/2016/wordml/cid" xmlns:w16se="http://schemas.microsoft.com/office/word/2015/wordml/symex">
   <w:p>
     <w:pPr>
-      <w:jc w:val="right"/>
+      <w:pBdr>
+        <w:bottom w:val="single" w:color="388E3C" w:sz="6" w:space="1"/>
+      </w:pBdr>
     </w:pPr>
     <w:r>
       <w:rPr>
-        <w:color w:val="808080"/>
-        <w:sz w:val="16"/>
-        <w:szCs w:val="16"/>
+        <w:rFonts w:ascii="Arial" w:cs="Arial" w:eastAsia="Arial" w:hAnsi="Arial"/>
+        <w:color w:val="555555"/>
+        <w:sz w:val="20"/>
+        <w:szCs w:val="20"/>
       </w:rPr>
-      <w:t xml:space="preserve">CPP102 — Week 1 Module (Revised)</w:t>
+      <w:t xml:space="preserve">CPP102: Programming Logic and Design  |  Week 1  |  Introduction to Python, Git, and GitHub</w:t>
     </w:r>
   </w:p>
 </w:hdr>

</xml_diff>

<commit_message>
Add CPP102 Week 4 module; commit pending Week 3 grading files and references
</commit_message>
<xml_diff>
--- a/CPP102-Programming-Logic-and-Design/Week01/CPP102_Week1_Lecture_Lab_Module.docx
+++ b/CPP102-Programming-Logic-and-Design/Week01/CPP102_Week1_Lecture_Lab_Module.docx
@@ -18576,8 +18576,8 @@
     <w:sectPr>
       <w:headerReference w:type="default" r:id="rId7"/>
       <w:footerReference w:type="default" r:id="rId8"/>
-      <w:pgSz w:w="12240" w:h="15840" w:orient="portrait"/>
-      <w:pgMar w:top="1440" w:right="1440" w:bottom="1440" w:left="1440" w:header="708" w:footer="708" w:gutter="0"/>
+      <w:pgSz w:w="12240" w:h="18720" w:orient="portrait"/>
+      <w:pgMar w:top="1080" w:right="1080" w:bottom="1080" w:left="1080" w:header="708" w:footer="708" w:gutter="0"/>
       <w:pgNumType/>
       <w:docGrid w:linePitch="360"/>
     </w:sectPr>

</xml_diff>